<commit_message>
small modification to 2 and 3
</commit_message>
<xml_diff>
--- a/2 - Apache Kafka.docx
+++ b/2 - Apache Kafka.docx
@@ -4289,7 +4289,13 @@
     </w:p>
     <w:p>
       <w:r>
-        <w:t>A topic is a named stream of events. In a Stridge-like backend, useful topic names could include:</w:t>
+        <w:t xml:space="preserve">A topic is a named stream of events. </w:t>
+      </w:r>
+      <w:r>
+        <w:t>U</w:t>
+      </w:r>
+      <w:r>
+        <w:t>seful topic names could include:</w:t>
       </w:r>
     </w:p>
     <w:p>
@@ -4552,7 +4558,7 @@
             </w:r>
             <w:r>
               <w:rPr>
-                <w:color w:val="B22222"/>
+                <w:color w:val="EE0000"/>
               </w:rPr>
               <w:t>Kafka guarantees ordering inside one partition. It does not provide one global order across all partitions.</w:t>
             </w:r>
@@ -4589,7 +4595,13 @@
     </w:p>
     <w:p>
       <w:r>
-        <w:t>A message key determines how related events are assigned to partitions. For example, using wallet_address as the key keeps every event for the same wallet on the same partition, preserving that wallet's event order.</w:t>
+        <w:rPr>
+          <w:color w:val="EE0000"/>
+        </w:rPr>
+        <w:t xml:space="preserve">A message key determines how related events are assigned to partitions. For example, using wallet_address as the key keeps every event for the same wallet on the same partition, </w:t>
+      </w:r>
+      <w:r>
+        <w:t>preserving that wallet's event order.</w:t>
       </w:r>
     </w:p>
     <w:tbl>
@@ -4674,12 +4686,6 @@
       </w:pPr>
     </w:p>
     <w:p>
-      <w:r>
-        <w:lastRenderedPageBreak/>
-        <w:t>Possible keys in a Stridge/KYT system include wallet address, deposit ID, UDA ID, settlement ID, and customer ID. The correct choice depends on which entity requires ordered processing.</w:t>
-      </w:r>
-    </w:p>
-    <w:p>
       <w:pPr>
         <w:pStyle w:val="Heading3"/>
         <w:pBdr>
@@ -4692,6 +4698,7 @@
           <w:rFonts w:ascii="Times New Roman" w:hAnsi="Times New Roman"/>
           <w:color w:val="222222"/>
         </w:rPr>
+        <w:lastRenderedPageBreak/>
         <w:t>Producer</w:t>
       </w:r>
       <w:bookmarkEnd w:id="7"/>
@@ -4883,16 +4890,6 @@
         </w:tc>
       </w:tr>
     </w:tbl>
-    <w:p>
-      <w:pPr>
-        <w:spacing w:after="20"/>
-      </w:pPr>
-    </w:p>
-    <w:p>
-      <w:r>
-        <w:t>Stridge's public UDA lifecycle similarly describes a deposit being detected and confirmed before a settlement is opened and eventually completed or failed. This is an educational mapping, not a claim about their private Kafka implementation.</w:t>
-      </w:r>
-    </w:p>
     <w:p>
       <w:pPr>
         <w:pStyle w:val="Heading3"/>
@@ -6518,161 +6515,6 @@
         <w:t>This reassignment process is a rebalance. Internal Kafka rebalance protocols are not required now; understand only the purpose.</w:t>
       </w:r>
     </w:p>
-    <w:p>
-      <w:pPr>
-        <w:pStyle w:val="Heading2"/>
-        <w:pBdr>
-          <w:bottom w:val="single" w:sz="4" w:space="1" w:color="BFBFBF"/>
-        </w:pBdr>
-      </w:pPr>
-      <w:bookmarkStart w:id="20" w:name="_Toc240633818"/>
-      <w:r>
-        <w:rPr>
-          <w:rFonts w:ascii="Times New Roman" w:hAnsi="Times New Roman"/>
-          <w:color w:val="222222"/>
-        </w:rPr>
-        <w:t>7. Why Kafka fits KYT</w:t>
-      </w:r>
-      <w:bookmarkEnd w:id="20"/>
-    </w:p>
-    <w:p>
-      <w:r>
-        <w:t>A KYT platform naturally has several independent consumers of blockchain data: real-time risk scoring, data-lake archival, analytics, and later model retraining.</w:t>
-      </w:r>
-    </w:p>
-    <w:tbl>
-      <w:tblPr>
-        <w:tblW w:w="0" w:type="auto"/>
-        <w:jc w:val="center"/>
-        <w:tblLook w:val="04A0" w:firstRow="1" w:lastRow="0" w:firstColumn="1" w:lastColumn="0" w:noHBand="0" w:noVBand="1"/>
-      </w:tblPr>
-      <w:tblGrid>
-        <w:gridCol w:w="10080"/>
-      </w:tblGrid>
-      <w:tr>
-        <w:trPr>
-          <w:cantSplit/>
-          <w:jc w:val="center"/>
-        </w:trPr>
-        <w:tc>
-          <w:tcPr>
-            <w:tcW w:w="10080" w:type="dxa"/>
-            <w:shd w:val="clear" w:color="auto" w:fill="F7F7F7"/>
-            <w:tcMar>
-              <w:top w:w="90" w:type="dxa"/>
-              <w:left w:w="130" w:type="dxa"/>
-              <w:bottom w:w="90" w:type="dxa"/>
-              <w:right w:w="130" w:type="dxa"/>
-            </w:tcMar>
-          </w:tcPr>
-          <w:p>
-            <w:pPr>
-              <w:spacing w:after="0" w:line="240" w:lineRule="auto"/>
-            </w:pPr>
-            <w:r>
-              <w:rPr>
-                <w:rFonts w:ascii="Consolas" w:eastAsia="Consolas" w:hAnsi="Consolas"/>
-                <w:color w:val="2D2D2D"/>
-                <w:sz w:val="19"/>
-              </w:rPr>
-              <w:lastRenderedPageBreak/>
-              <w:t>Blockchain indexers</w:t>
-            </w:r>
-            <w:r>
-              <w:rPr>
-                <w:rFonts w:ascii="Consolas" w:eastAsia="Consolas" w:hAnsi="Consolas"/>
-                <w:color w:val="2D2D2D"/>
-                <w:sz w:val="19"/>
-              </w:rPr>
-              <w:br/>
-              <w:t xml:space="preserve">       |</w:t>
-            </w:r>
-            <w:r>
-              <w:rPr>
-                <w:rFonts w:ascii="Consolas" w:eastAsia="Consolas" w:hAnsi="Consolas"/>
-                <w:color w:val="2D2D2D"/>
-                <w:sz w:val="19"/>
-              </w:rPr>
-              <w:br/>
-              <w:t xml:space="preserve">       v</w:t>
-            </w:r>
-            <w:r>
-              <w:rPr>
-                <w:rFonts w:ascii="Consolas" w:eastAsia="Consolas" w:hAnsi="Consolas"/>
-                <w:color w:val="2D2D2D"/>
-                <w:sz w:val="19"/>
-              </w:rPr>
-              <w:br/>
-              <w:t>Kafka topic: transactions</w:t>
-            </w:r>
-            <w:r>
-              <w:rPr>
-                <w:rFonts w:ascii="Consolas" w:eastAsia="Consolas" w:hAnsi="Consolas"/>
-                <w:color w:val="2D2D2D"/>
-                <w:sz w:val="19"/>
-              </w:rPr>
-              <w:br/>
-              <w:t xml:space="preserve">       |</w:t>
-            </w:r>
-            <w:r>
-              <w:rPr>
-                <w:rFonts w:ascii="Consolas" w:eastAsia="Consolas" w:hAnsi="Consolas"/>
-                <w:color w:val="2D2D2D"/>
-                <w:sz w:val="19"/>
-              </w:rPr>
-              <w:br/>
-              <w:t>------------------------------------</w:t>
-            </w:r>
-            <w:r>
-              <w:rPr>
-                <w:rFonts w:ascii="Consolas" w:eastAsia="Consolas" w:hAnsi="Consolas"/>
-                <w:color w:val="2D2D2D"/>
-                <w:sz w:val="19"/>
-              </w:rPr>
-              <w:br/>
-              <w:t>|                 |                |</w:t>
-            </w:r>
-            <w:r>
-              <w:rPr>
-                <w:rFonts w:ascii="Consolas" w:eastAsia="Consolas" w:hAnsi="Consolas"/>
-                <w:color w:val="2D2D2D"/>
-                <w:sz w:val="19"/>
-              </w:rPr>
-              <w:br/>
-              <w:t>v                 v                v</w:t>
-            </w:r>
-            <w:r>
-              <w:rPr>
-                <w:rFonts w:ascii="Consolas" w:eastAsia="Consolas" w:hAnsi="Consolas"/>
-                <w:color w:val="2D2D2D"/>
-                <w:sz w:val="19"/>
-              </w:rPr>
-              <w:br/>
-              <w:t>KYT realtime   Data lake        Analytics</w:t>
-            </w:r>
-            <w:r>
-              <w:rPr>
-                <w:rFonts w:ascii="Consolas" w:eastAsia="Consolas" w:hAnsi="Consolas"/>
-                <w:color w:val="2D2D2D"/>
-                <w:sz w:val="19"/>
-              </w:rPr>
-              <w:br/>
-              <w:t>consumer       sink</w:t>
-            </w:r>
-          </w:p>
-        </w:tc>
-      </w:tr>
-    </w:tbl>
-    <w:p>
-      <w:pPr>
-        <w:spacing w:after="20"/>
-      </w:pPr>
-    </w:p>
-    <w:p>
-      <w:r>
-        <w:t>Later, a new model can process historical events again. This retained, replayable stream is why Kafka fits data pipelines better than forcing every internal purpose through a synchronous POST /kyt call.</w:t>
-      </w:r>
-    </w:p>
     <w:sectPr>
       <w:footerReference w:type="default" r:id="rId11"/>
       <w:pgSz w:w="12240" w:h="15840"/>
@@ -6716,13 +6558,6 @@
       <w:pStyle w:val="Footer"/>
       <w:jc w:val="right"/>
     </w:pPr>
-    <w:r>
-      <w:rPr>
-        <w:color w:val="646464"/>
-        <w:sz w:val="20"/>
-      </w:rPr>
-      <w:t xml:space="preserve">Backend Notes | Arsham Haqiqat | </w:t>
-    </w:r>
     <w:r>
       <w:fldChar w:fldCharType="begin"/>
     </w:r>

</xml_diff>